<commit_message>
docs: merge the split Uber/Bolt stint in the CVs and publish them as PDF
The driving job was listed twice: March 2024 - May 2024 and again
September 2024 - Current. It is one continuous stint, so the two entries
are now a single "March 2024 - Current" line and the duplicate is gone.

Both CVs are exported to PDF (cv-ro.pdf, cv-en.pdf) and about.html links
to those instead of the .docx; the .docx files stay in the repo as the
editable source. The .png previews are re-rendered from the new PDFs.

Co-Authored-By: Claude Opus 5 <noreply@anthropic.com>
</commit_message>
<xml_diff>
--- a/Images/Documents/cv-en.docx
+++ b/Images/Documents/cv-en.docx
@@ -853,7 +853,7 @@
                 <w:sz w:val="20"/>
                 <w:szCs w:val="20"/>
               </w:rPr>
-              <w:t xml:space="preserve">September 2024 - Current</w:t>
+              <w:t>March 2024 - Current</w:t>
             </w:r>
           </w:p>
           <w:p>
@@ -1001,46 +1001,6 @@
                 <w:szCs w:val="20"/>
               </w:rPr>
               <w:t xml:space="preserve">Auto Cobălcescu - BMW</w:t>
-            </w:r>
-          </w:p>
-          <w:p>
-            <w:pPr>
-              <w:spacing w:after="10" w:before="100"/>
-            </w:pPr>
-            <w:r>
-              <w:rPr>
-                <w:color w:val="1A1A1A"/>
-                <w:sz w:val="20"/>
-                <w:szCs w:val="20"/>
-              </w:rPr>
-              <w:t xml:space="preserve">March 2024 - May 2024</w:t>
-            </w:r>
-          </w:p>
-          <w:p>
-            <w:pPr>
-              <w:spacing w:after="20"/>
-            </w:pPr>
-            <w:r>
-              <w:rPr>
-                <w:b/>
-                <w:bCs/>
-                <w:color w:val="1A1A1A"/>
-                <w:sz w:val="20"/>
-                <w:szCs w:val="20"/>
-              </w:rPr>
-              <w:t xml:space="preserve">Driver </w:t>
-            </w:r>
-            <w:r>
-              <w:rPr>
-                <w:b/>
-                <w:bCs/>
-                <w:i/>
-                <w:iCs/>
-                <w:color w:val="1A1A1A"/>
-                <w:sz w:val="20"/>
-                <w:szCs w:val="20"/>
-              </w:rPr>
-              <w:t xml:space="preserve">Uber - Bolt</w:t>
             </w:r>
           </w:p>
           <w:p>

</xml_diff>